<commit_message>
Slightly updated project proposal
</commit_message>
<xml_diff>
--- a/Documents/Project Proposal.docx
+++ b/Documents/Project Proposal.docx
@@ -1,6 +1,6 @@
 
 <file path=word/document.xml><?xml version="1.0" encoding="utf-8"?>
-<w:document xmlns:wpc="http://schemas.microsoft.com/office/word/2010/wordprocessingCanvas" xmlns:cx="http://schemas.microsoft.com/office/drawing/2014/chartex" xmlns:cx1="http://schemas.microsoft.com/office/drawing/2015/9/8/chartex" xmlns:cx2="http://schemas.microsoft.com/office/drawing/2015/10/21/chartex" xmlns:cx3="http://schemas.microsoft.com/office/drawing/2016/5/9/chartex" xmlns:cx4="http://schemas.microsoft.com/office/drawing/2016/5/10/chartex" xmlns:cx5="http://schemas.microsoft.com/office/drawing/2016/5/11/chartex" xmlns:cx6="http://schemas.microsoft.com/office/drawing/2016/5/12/chartex" xmlns:cx7="http://schemas.microsoft.com/office/drawing/2016/5/13/chartex" xmlns:cx8="http://schemas.microsoft.com/office/drawing/2016/5/14/chartex" xmlns:mc="http://schemas.openxmlformats.org/markup-compatibility/2006" xmlns:aink="http://schemas.microsoft.com/office/drawing/2016/ink" xmlns:am3d="http://schemas.microsoft.com/office/drawing/2017/model3d" xmlns:o="urn:schemas-microsoft-com:office:office" xmlns:oel="http://schemas.microsoft.com/office/2019/extlst" xmlns:r="http://schemas.openxmlformats.org/officeDocument/2006/relationships" xmlns:m="http://schemas.openxmlformats.org/officeDocument/2006/math" xmlns:v="urn:schemas-microsoft-com:vml" xmlns:wp14="http://schemas.microsoft.com/office/word/2010/wordprocessingDrawing" xmlns:wp="http://schemas.openxmlformats.org/drawingml/2006/wordprocessingDrawing" xmlns:w10="urn:schemas-microsoft-com:office:word" xmlns:w="http://schemas.openxmlformats.org/wordprocessingml/2006/main" xmlns:w14="http://schemas.microsoft.com/office/word/2010/wordml" xmlns:w15="http://schemas.microsoft.com/office/word/2012/wordml" xmlns:w16cex="http://schemas.microsoft.com/office/word/2018/wordml/cex" xmlns:w16cid="http://schemas.microsoft.com/office/word/2016/wordml/cid" xmlns:w16="http://schemas.microsoft.com/office/word/2018/wordml" xmlns:w16du="http://schemas.microsoft.com/office/word/2023/wordml/word16du" xmlns:w16sdtdh="http://schemas.microsoft.com/office/word/2020/wordml/sdtdatahash" xmlns:w16sdtfl="http://schemas.microsoft.com/office/word/2024/wordml/sdtformatlock" xmlns:w16se="http://schemas.microsoft.com/office/word/2015/wordml/symex" xmlns:wpg="http://schemas.microsoft.com/office/word/2010/wordprocessingGroup" xmlns:wpi="http://schemas.microsoft.com/office/word/2010/wordprocessingInk" xmlns:wne="http://schemas.microsoft.com/office/word/2006/wordml" xmlns:wps="http://schemas.microsoft.com/office/word/2010/wordprocessingShape" mc:Ignorable="w14 w15 w16se w16cid w16 w16cex w16sdtdh w16sdtfl w16du wp14">
+<w:document xmlns:wpc="http://schemas.microsoft.com/office/word/2010/wordprocessingCanvas" xmlns:cx="http://schemas.microsoft.com/office/drawing/2014/chartex" xmlns:cx1="http://schemas.microsoft.com/office/drawing/2015/9/8/chartex" xmlns:cx2="http://schemas.microsoft.com/office/drawing/2015/10/21/chartex" xmlns:cx3="http://schemas.microsoft.com/office/drawing/2016/5/9/chartex" xmlns:cx4="http://schemas.microsoft.com/office/drawing/2016/5/10/chartex" xmlns:cx5="http://schemas.microsoft.com/office/drawing/2016/5/11/chartex" xmlns:cx6="http://schemas.microsoft.com/office/drawing/2016/5/12/chartex" xmlns:cx7="http://schemas.microsoft.com/office/drawing/2016/5/13/chartex" xmlns:cx8="http://schemas.microsoft.com/office/drawing/2016/5/14/chartex" xmlns:mc="http://schemas.openxmlformats.org/markup-compatibility/2006" xmlns:aink="http://schemas.microsoft.com/office/drawing/2016/ink" xmlns:am3d="http://schemas.microsoft.com/office/drawing/2017/model3d" xmlns:o="urn:schemas-microsoft-com:office:office" xmlns:oel="http://schemas.microsoft.com/office/2019/extlst" xmlns:r="http://schemas.openxmlformats.org/officeDocument/2006/relationships" xmlns:m="http://schemas.openxmlformats.org/officeDocument/2006/math" xmlns:v="urn:schemas-microsoft-com:vml" xmlns:wp14="http://schemas.microsoft.com/office/word/2010/wordprocessingDrawing" xmlns:wp="http://schemas.openxmlformats.org/drawingml/2006/wordprocessingDrawing" xmlns:w10="urn:schemas-microsoft-com:office:word" xmlns:w="http://schemas.openxmlformats.org/wordprocessingml/2006/main" xmlns:w14="http://schemas.microsoft.com/office/word/2010/wordml" xmlns:w15="http://schemas.microsoft.com/office/word/2012/wordml" xmlns:w16cex="http://schemas.microsoft.com/office/word/2018/wordml/cex" xmlns:w16cid="http://schemas.microsoft.com/office/word/2016/wordml/cid" xmlns:w16="http://schemas.microsoft.com/office/word/2018/wordml" xmlns:w16sdtdh="http://schemas.microsoft.com/office/word/2020/wordml/sdtdatahash" xmlns:w16se="http://schemas.microsoft.com/office/word/2015/wordml/symex" xmlns:wpg="http://schemas.microsoft.com/office/word/2010/wordprocessingGroup" xmlns:wpi="http://schemas.microsoft.com/office/word/2010/wordprocessingInk" xmlns:wne="http://schemas.microsoft.com/office/word/2006/wordml" xmlns:wps="http://schemas.microsoft.com/office/word/2010/wordprocessingShape" mc:Ignorable="w14 w15 w16se w16cid w16 w16cex w16sdtdh wp14">
   <w:body>
     <w:p>
       <w:pPr>
@@ -12,75 +12,6 @@
           <w:szCs w:val="24"/>
         </w:rPr>
       </w:pPr>
-      <w:r>
-        <w:rPr>
-          <w:rFonts w:ascii="Times New Roman" w:hAnsi="Times New Roman" w:cs="Times New Roman"/>
-          <w:noProof/>
-          <w:sz w:val="24"/>
-          <w:szCs w:val="24"/>
-        </w:rPr>
-        <w:drawing>
-          <wp:anchor distT="0" distB="0" distL="114300" distR="114300" simplePos="0" relativeHeight="251658240" behindDoc="1" locked="0" layoutInCell="1" allowOverlap="1" wp14:anchorId="4B6B397D" wp14:editId="26A8A31B">
-            <wp:simplePos x="0" y="0"/>
-            <wp:positionH relativeFrom="column">
-              <wp:posOffset>3383280</wp:posOffset>
-            </wp:positionH>
-            <wp:positionV relativeFrom="paragraph">
-              <wp:posOffset>-175260</wp:posOffset>
-            </wp:positionV>
-            <wp:extent cx="3429000" cy="1388745"/>
-            <wp:effectExtent l="0" t="0" r="0" b="1905"/>
-            <wp:wrapNone/>
-            <wp:docPr id="520225627" name="Picture 1">
-              <a:extLst xmlns:a="http://schemas.openxmlformats.org/drawingml/2006/main">
-                <a:ext uri="{FF2B5EF4-FFF2-40B4-BE49-F238E27FC236}">
-                  <a16:creationId xmlns:a16="http://schemas.microsoft.com/office/drawing/2014/main" id="{2CB3CF79-8A59-49FA-A644-9395284D3DE7}"/>
-                </a:ext>
-              </a:extLst>
-            </wp:docPr>
-            <wp:cNvGraphicFramePr>
-              <a:graphicFrameLocks xmlns:a="http://schemas.openxmlformats.org/drawingml/2006/main" noChangeAspect="1"/>
-            </wp:cNvGraphicFramePr>
-            <a:graphic xmlns:a="http://schemas.openxmlformats.org/drawingml/2006/main">
-              <a:graphicData uri="http://schemas.openxmlformats.org/drawingml/2006/picture">
-                <pic:pic xmlns:pic="http://schemas.openxmlformats.org/drawingml/2006/picture">
-                  <pic:nvPicPr>
-                    <pic:cNvPr id="520225627" name=""/>
-                    <pic:cNvPicPr/>
-                  </pic:nvPicPr>
-                  <pic:blipFill>
-                    <a:blip r:embed="rId7">
-                      <a:extLst>
-                        <a:ext uri="{28A0092B-C50C-407E-A947-70E740481C1C}">
-                          <a14:useLocalDpi xmlns:a14="http://schemas.microsoft.com/office/drawing/2010/main" val="0"/>
-                        </a:ext>
-                      </a:extLst>
-                    </a:blip>
-                    <a:stretch>
-                      <a:fillRect/>
-                    </a:stretch>
-                  </pic:blipFill>
-                  <pic:spPr>
-                    <a:xfrm>
-                      <a:off x="0" y="0"/>
-                      <a:ext cx="3429000" cy="1388745"/>
-                    </a:xfrm>
-                    <a:prstGeom prst="rect">
-                      <a:avLst/>
-                    </a:prstGeom>
-                  </pic:spPr>
-                </pic:pic>
-              </a:graphicData>
-            </a:graphic>
-            <wp14:sizeRelH relativeFrom="margin">
-              <wp14:pctWidth>0</wp14:pctWidth>
-            </wp14:sizeRelH>
-            <wp14:sizeRelV relativeFrom="margin">
-              <wp14:pctHeight>0</wp14:pctHeight>
-            </wp14:sizeRelV>
-          </wp:anchor>
-        </w:drawing>
-      </w:r>
       <w:r>
         <w:rPr>
           <w:rFonts w:ascii="Times New Roman" w:hAnsi="Times New Roman" w:cs="Times New Roman"/>
@@ -661,308 +592,166 @@
     <w:p>
       <w:pPr>
         <w:spacing w:line="480" w:lineRule="auto"/>
+        <w:contextualSpacing/>
+        <w:rPr>
+          <w:rFonts w:ascii="Times New Roman" w:hAnsi="Times New Roman" w:cs="Times New Roman"/>
+          <w:sz w:val="24"/>
+          <w:szCs w:val="24"/>
+        </w:rPr>
+      </w:pPr>
+      <w:r>
+        <w:rPr>
+          <w:rFonts w:ascii="Times New Roman" w:hAnsi="Times New Roman" w:cs="Times New Roman"/>
+          <w:sz w:val="24"/>
+          <w:szCs w:val="24"/>
+        </w:rPr>
+        <w:t>ASP.NET Core MVC / C# – main application and server-side logic.</w:t>
+      </w:r>
+    </w:p>
+    <w:p>
+      <w:pPr>
+        <w:spacing w:line="480" w:lineRule="auto"/>
+        <w:contextualSpacing/>
+        <w:rPr>
+          <w:rFonts w:ascii="Times New Roman" w:hAnsi="Times New Roman" w:cs="Times New Roman"/>
+          <w:sz w:val="24"/>
+          <w:szCs w:val="24"/>
+        </w:rPr>
+      </w:pPr>
+      <w:r>
+        <w:rPr>
+          <w:rFonts w:ascii="Times New Roman" w:hAnsi="Times New Roman" w:cs="Times New Roman"/>
+          <w:sz w:val="24"/>
+          <w:szCs w:val="24"/>
+        </w:rPr>
+        <w:t>Entity Framework Core / SQL Server – database access and storage.</w:t>
+      </w:r>
+    </w:p>
+    <w:p>
+      <w:pPr>
+        <w:spacing w:line="480" w:lineRule="auto"/>
+        <w:contextualSpacing/>
+        <w:rPr>
+          <w:rFonts w:ascii="Times New Roman" w:hAnsi="Times New Roman" w:cs="Times New Roman"/>
+          <w:sz w:val="24"/>
+          <w:szCs w:val="24"/>
+        </w:rPr>
+      </w:pPr>
+      <w:r>
+        <w:rPr>
+          <w:rFonts w:ascii="Times New Roman" w:hAnsi="Times New Roman" w:cs="Times New Roman"/>
+          <w:sz w:val="24"/>
+          <w:szCs w:val="24"/>
+        </w:rPr>
+        <w:t>RESTful Web API – retrieve and manage earbud data using GET, POST, PUT, and DELETE.</w:t>
+      </w:r>
+    </w:p>
+    <w:p>
+      <w:pPr>
+        <w:spacing w:line="480" w:lineRule="auto"/>
+        <w:contextualSpacing/>
+        <w:rPr>
+          <w:rFonts w:ascii="Times New Roman" w:hAnsi="Times New Roman" w:cs="Times New Roman"/>
+          <w:sz w:val="24"/>
+          <w:szCs w:val="24"/>
+        </w:rPr>
+      </w:pPr>
+      <w:r>
+        <w:rPr>
+          <w:rFonts w:ascii="Times New Roman" w:hAnsi="Times New Roman" w:cs="Times New Roman"/>
+          <w:sz w:val="24"/>
+          <w:szCs w:val="24"/>
+        </w:rPr>
+        <w:t>HTML/CSS / Bootstrap – responsive and customized user interface.</w:t>
+      </w:r>
+    </w:p>
+    <w:p>
+      <w:pPr>
+        <w:spacing w:line="480" w:lineRule="auto"/>
+        <w:contextualSpacing/>
+        <w:rPr>
+          <w:rFonts w:ascii="Times New Roman" w:hAnsi="Times New Roman" w:cs="Times New Roman"/>
+          <w:sz w:val="24"/>
+          <w:szCs w:val="24"/>
+        </w:rPr>
+      </w:pPr>
+      <w:r>
+        <w:rPr>
+          <w:rFonts w:ascii="Times New Roman" w:hAnsi="Times New Roman" w:cs="Times New Roman"/>
+          <w:sz w:val="24"/>
+          <w:szCs w:val="24"/>
+        </w:rPr>
+        <w:t>JavaScript / AJAX / Fetch API – asynchronous filtering and favorites without page reloads.</w:t>
+      </w:r>
+    </w:p>
+    <w:p>
+      <w:pPr>
+        <w:spacing w:line="480" w:lineRule="auto"/>
+        <w:contextualSpacing/>
+        <w:rPr>
+          <w:rFonts w:ascii="Times New Roman" w:hAnsi="Times New Roman" w:cs="Times New Roman"/>
+          <w:sz w:val="24"/>
+          <w:szCs w:val="24"/>
+        </w:rPr>
+      </w:pPr>
+      <w:r>
+        <w:rPr>
+          <w:rFonts w:ascii="Times New Roman" w:hAnsi="Times New Roman" w:cs="Times New Roman"/>
+          <w:sz w:val="24"/>
+          <w:szCs w:val="24"/>
+        </w:rPr>
+        <w:t>ASP.NET Core Identity – user authentication and admin authorization.</w:t>
+      </w:r>
+    </w:p>
+    <w:p>
+      <w:pPr>
+        <w:spacing w:line="480" w:lineRule="auto"/>
+        <w:contextualSpacing/>
+        <w:rPr>
+          <w:rFonts w:ascii="Times New Roman" w:hAnsi="Times New Roman" w:cs="Times New Roman"/>
+          <w:sz w:val="24"/>
+          <w:szCs w:val="24"/>
+        </w:rPr>
+      </w:pPr>
+      <w:r>
+        <w:rPr>
+          <w:rFonts w:ascii="Times New Roman" w:hAnsi="Times New Roman" w:cs="Times New Roman"/>
+          <w:sz w:val="24"/>
+          <w:szCs w:val="24"/>
+        </w:rPr>
+        <w:t>Git / GitHub Desktop – version control and team collaboration.</w:t>
+      </w:r>
+    </w:p>
+    <w:p>
+      <w:pPr>
+        <w:spacing w:line="480" w:lineRule="auto"/>
+        <w:contextualSpacing/>
+        <w:rPr>
+          <w:rFonts w:ascii="Times New Roman" w:hAnsi="Times New Roman" w:cs="Times New Roman"/>
+          <w:sz w:val="24"/>
+          <w:szCs w:val="24"/>
+        </w:rPr>
+      </w:pPr>
+    </w:p>
+    <w:p>
+      <w:pPr>
+        <w:spacing w:line="480" w:lineRule="auto"/>
         <w:ind w:firstLine="720"/>
-        <w:rPr>
-          <w:rFonts w:ascii="Times New Roman" w:hAnsi="Times New Roman" w:cs="Times New Roman"/>
-          <w:sz w:val="24"/>
-          <w:szCs w:val="24"/>
-        </w:rPr>
-      </w:pPr>
-      <w:r>
-        <w:rPr>
-          <w:rFonts w:ascii="Times New Roman" w:hAnsi="Times New Roman" w:cs="Times New Roman"/>
-          <w:sz w:val="24"/>
-          <w:szCs w:val="24"/>
-        </w:rPr>
-        <w:t xml:space="preserve">We’re going to use </w:t>
-      </w:r>
-      <w:r>
-        <w:rPr>
-          <w:rFonts w:ascii="Times New Roman" w:hAnsi="Times New Roman" w:cs="Times New Roman"/>
-          <w:sz w:val="24"/>
-          <w:szCs w:val="24"/>
-        </w:rPr>
-        <w:t>ASP.NET Core MVC for the main website</w:t>
-      </w:r>
-      <w:r>
-        <w:rPr>
-          <w:rFonts w:ascii="Times New Roman" w:hAnsi="Times New Roman" w:cs="Times New Roman"/>
-          <w:sz w:val="24"/>
-          <w:szCs w:val="24"/>
-        </w:rPr>
-        <w:t>.</w:t>
-      </w:r>
-      <w:r>
-        <w:rPr>
-          <w:rFonts w:ascii="Times New Roman" w:hAnsi="Times New Roman" w:cs="Times New Roman"/>
-          <w:sz w:val="24"/>
-          <w:szCs w:val="24"/>
-        </w:rPr>
-        <w:t xml:space="preserve"> </w:t>
-      </w:r>
-      <w:r>
-        <w:rPr>
-          <w:rFonts w:ascii="Times New Roman" w:hAnsi="Times New Roman" w:cs="Times New Roman"/>
-          <w:sz w:val="24"/>
-          <w:szCs w:val="24"/>
-        </w:rPr>
-        <w:t>C# for the application code</w:t>
-      </w:r>
-      <w:r>
-        <w:rPr>
-          <w:rFonts w:ascii="Times New Roman" w:hAnsi="Times New Roman" w:cs="Times New Roman"/>
-          <w:sz w:val="24"/>
-          <w:szCs w:val="24"/>
-        </w:rPr>
-        <w:t>.</w:t>
-      </w:r>
-      <w:r>
-        <w:rPr>
-          <w:rFonts w:ascii="Times New Roman" w:hAnsi="Times New Roman" w:cs="Times New Roman"/>
-          <w:sz w:val="24"/>
-          <w:szCs w:val="24"/>
-        </w:rPr>
-        <w:t xml:space="preserve"> </w:t>
-      </w:r>
-      <w:r>
-        <w:rPr>
-          <w:rFonts w:ascii="Times New Roman" w:hAnsi="Times New Roman" w:cs="Times New Roman"/>
-          <w:sz w:val="24"/>
-          <w:szCs w:val="24"/>
-        </w:rPr>
-        <w:t>Entity Framework Core for working with the database</w:t>
-      </w:r>
-      <w:r>
-        <w:rPr>
-          <w:rFonts w:ascii="Times New Roman" w:hAnsi="Times New Roman" w:cs="Times New Roman"/>
-          <w:sz w:val="24"/>
-          <w:szCs w:val="24"/>
-        </w:rPr>
-        <w:t>.</w:t>
-      </w:r>
-      <w:r>
-        <w:rPr>
-          <w:rFonts w:ascii="Times New Roman" w:hAnsi="Times New Roman" w:cs="Times New Roman"/>
-          <w:sz w:val="24"/>
-          <w:szCs w:val="24"/>
-        </w:rPr>
-        <w:t xml:space="preserve"> </w:t>
-      </w:r>
-      <w:r>
-        <w:rPr>
-          <w:rFonts w:ascii="Times New Roman" w:hAnsi="Times New Roman" w:cs="Times New Roman"/>
-          <w:sz w:val="24"/>
-          <w:szCs w:val="24"/>
-        </w:rPr>
-        <w:t>SQL Server for storing the data</w:t>
-      </w:r>
-      <w:r>
-        <w:rPr>
-          <w:rFonts w:ascii="Times New Roman" w:hAnsi="Times New Roman" w:cs="Times New Roman"/>
-          <w:sz w:val="24"/>
-          <w:szCs w:val="24"/>
-        </w:rPr>
-        <w:t>.</w:t>
-      </w:r>
-      <w:r>
-        <w:rPr>
-          <w:rFonts w:ascii="Times New Roman" w:hAnsi="Times New Roman" w:cs="Times New Roman"/>
-          <w:sz w:val="24"/>
-          <w:szCs w:val="24"/>
-        </w:rPr>
-        <w:t xml:space="preserve"> </w:t>
-      </w:r>
-      <w:r>
-        <w:rPr>
-          <w:rFonts w:ascii="Times New Roman" w:hAnsi="Times New Roman" w:cs="Times New Roman"/>
-          <w:sz w:val="24"/>
-          <w:szCs w:val="24"/>
-        </w:rPr>
-        <w:t>RESTful Web API for getting and managing earbud data</w:t>
-      </w:r>
-      <w:r>
-        <w:rPr>
-          <w:rFonts w:ascii="Times New Roman" w:hAnsi="Times New Roman" w:cs="Times New Roman"/>
-          <w:sz w:val="24"/>
-          <w:szCs w:val="24"/>
-        </w:rPr>
-        <w:t>.</w:t>
-      </w:r>
-      <w:r>
-        <w:rPr>
-          <w:rFonts w:ascii="Times New Roman" w:hAnsi="Times New Roman" w:cs="Times New Roman"/>
-          <w:sz w:val="24"/>
-          <w:szCs w:val="24"/>
-        </w:rPr>
-        <w:t xml:space="preserve"> </w:t>
-      </w:r>
-      <w:r>
-        <w:rPr>
-          <w:rFonts w:ascii="Times New Roman" w:hAnsi="Times New Roman" w:cs="Times New Roman"/>
-          <w:sz w:val="24"/>
-          <w:szCs w:val="24"/>
-        </w:rPr>
-        <w:t>HTML/CSS for the website</w:t>
-      </w:r>
-      <w:r>
-        <w:rPr>
-          <w:rFonts w:ascii="Times New Roman" w:hAnsi="Times New Roman" w:cs="Times New Roman"/>
-          <w:sz w:val="24"/>
-          <w:szCs w:val="24"/>
-        </w:rPr>
-        <w:t>.</w:t>
-      </w:r>
-      <w:r>
-        <w:rPr>
-          <w:rFonts w:ascii="Times New Roman" w:hAnsi="Times New Roman" w:cs="Times New Roman"/>
-          <w:sz w:val="24"/>
-          <w:szCs w:val="24"/>
-        </w:rPr>
-        <w:t xml:space="preserve"> </w:t>
-      </w:r>
-      <w:r>
-        <w:rPr>
-          <w:rFonts w:ascii="Times New Roman" w:hAnsi="Times New Roman" w:cs="Times New Roman"/>
-          <w:sz w:val="24"/>
-          <w:szCs w:val="24"/>
-        </w:rPr>
-        <w:t>Bootstrap for the responsive design</w:t>
-      </w:r>
-      <w:r>
-        <w:rPr>
-          <w:rFonts w:ascii="Times New Roman" w:hAnsi="Times New Roman" w:cs="Times New Roman"/>
-          <w:sz w:val="24"/>
-          <w:szCs w:val="24"/>
-        </w:rPr>
-        <w:t>.</w:t>
-      </w:r>
-      <w:r>
-        <w:rPr>
-          <w:rFonts w:ascii="Times New Roman" w:hAnsi="Times New Roman" w:cs="Times New Roman"/>
-          <w:sz w:val="24"/>
-          <w:szCs w:val="24"/>
-        </w:rPr>
-        <w:t xml:space="preserve"> </w:t>
-      </w:r>
-      <w:r>
-        <w:rPr>
-          <w:rFonts w:ascii="Times New Roman" w:hAnsi="Times New Roman" w:cs="Times New Roman"/>
-          <w:sz w:val="24"/>
-          <w:szCs w:val="24"/>
-        </w:rPr>
-        <w:t>JavaScrip</w:t>
-      </w:r>
-      <w:r>
-        <w:rPr>
-          <w:rFonts w:ascii="Times New Roman" w:hAnsi="Times New Roman" w:cs="Times New Roman"/>
-          <w:sz w:val="24"/>
-          <w:szCs w:val="24"/>
-        </w:rPr>
-        <w:t>t</w:t>
-      </w:r>
-      <w:r>
-        <w:rPr>
-          <w:rFonts w:ascii="Times New Roman" w:hAnsi="Times New Roman" w:cs="Times New Roman"/>
-          <w:sz w:val="24"/>
-          <w:szCs w:val="24"/>
-        </w:rPr>
-        <w:t xml:space="preserve"> for interactive features</w:t>
-      </w:r>
-      <w:r>
-        <w:rPr>
-          <w:rFonts w:ascii="Times New Roman" w:hAnsi="Times New Roman" w:cs="Times New Roman"/>
-          <w:sz w:val="24"/>
-          <w:szCs w:val="24"/>
-        </w:rPr>
-        <w:t>.</w:t>
-      </w:r>
-      <w:r>
-        <w:rPr>
-          <w:rFonts w:ascii="Times New Roman" w:hAnsi="Times New Roman" w:cs="Times New Roman"/>
-          <w:sz w:val="24"/>
-          <w:szCs w:val="24"/>
-        </w:rPr>
-        <w:t xml:space="preserve"> </w:t>
-      </w:r>
-      <w:r>
-        <w:rPr>
-          <w:rFonts w:ascii="Times New Roman" w:hAnsi="Times New Roman" w:cs="Times New Roman"/>
-          <w:sz w:val="24"/>
-          <w:szCs w:val="24"/>
-        </w:rPr>
-        <w:t>AJAX/Fetch API for updating information without refreshing the page</w:t>
-      </w:r>
-      <w:r>
-        <w:rPr>
-          <w:rFonts w:ascii="Times New Roman" w:hAnsi="Times New Roman" w:cs="Times New Roman"/>
-          <w:sz w:val="24"/>
-          <w:szCs w:val="24"/>
-        </w:rPr>
-        <w:t>.</w:t>
-      </w:r>
-      <w:r>
-        <w:rPr>
-          <w:rFonts w:ascii="Times New Roman" w:hAnsi="Times New Roman" w:cs="Times New Roman"/>
-          <w:sz w:val="24"/>
-          <w:szCs w:val="24"/>
-        </w:rPr>
-        <w:t xml:space="preserve"> </w:t>
-      </w:r>
-      <w:r>
-        <w:rPr>
-          <w:rFonts w:ascii="Times New Roman" w:hAnsi="Times New Roman" w:cs="Times New Roman"/>
-          <w:sz w:val="24"/>
-          <w:szCs w:val="24"/>
-        </w:rPr>
-        <w:t>ASP.NET Core Identity for login and user permissions</w:t>
-      </w:r>
-      <w:r>
-        <w:rPr>
-          <w:rFonts w:ascii="Times New Roman" w:hAnsi="Times New Roman" w:cs="Times New Roman"/>
-          <w:sz w:val="24"/>
-          <w:szCs w:val="24"/>
-        </w:rPr>
-        <w:t>.</w:t>
-      </w:r>
-      <w:r>
-        <w:rPr>
-          <w:rFonts w:ascii="Times New Roman" w:hAnsi="Times New Roman" w:cs="Times New Roman"/>
-          <w:sz w:val="24"/>
-          <w:szCs w:val="24"/>
-        </w:rPr>
-        <w:t xml:space="preserve"> </w:t>
-      </w:r>
-      <w:r>
-        <w:rPr>
-          <w:rFonts w:ascii="Times New Roman" w:hAnsi="Times New Roman" w:cs="Times New Roman"/>
-          <w:sz w:val="24"/>
-          <w:szCs w:val="24"/>
-        </w:rPr>
-        <w:t xml:space="preserve">GitHub </w:t>
-      </w:r>
-      <w:r>
-        <w:rPr>
-          <w:rFonts w:ascii="Times New Roman" w:hAnsi="Times New Roman" w:cs="Times New Roman"/>
-          <w:sz w:val="24"/>
-          <w:szCs w:val="24"/>
-        </w:rPr>
-        <w:t xml:space="preserve">Desktop </w:t>
-      </w:r>
-      <w:r>
-        <w:rPr>
-          <w:rFonts w:ascii="Times New Roman" w:hAnsi="Times New Roman" w:cs="Times New Roman"/>
-          <w:sz w:val="24"/>
-          <w:szCs w:val="24"/>
-        </w:rPr>
-        <w:t>for version control</w:t>
-      </w:r>
-      <w:r>
-        <w:rPr>
-          <w:rFonts w:ascii="Times New Roman" w:hAnsi="Times New Roman" w:cs="Times New Roman"/>
-          <w:sz w:val="24"/>
-          <w:szCs w:val="24"/>
-        </w:rPr>
-        <w:t>.</w:t>
+        <w:contextualSpacing/>
+        <w:jc w:val="center"/>
+        <w:rPr>
+          <w:rFonts w:ascii="Times New Roman" w:hAnsi="Times New Roman" w:cs="Times New Roman"/>
+          <w:sz w:val="24"/>
+          <w:szCs w:val="24"/>
+        </w:rPr>
+      </w:pPr>
+      <w:r>
+        <w:rPr>
+          <w:rFonts w:ascii="Times New Roman" w:hAnsi="Times New Roman" w:cs="Times New Roman"/>
+          <w:sz w:val="24"/>
+          <w:szCs w:val="24"/>
+        </w:rPr>
+        <w:t>AI Disclosure</w:t>
       </w:r>
     </w:p>
     <w:p>
@@ -976,50 +765,26 @@
           <w:szCs w:val="24"/>
         </w:rPr>
       </w:pPr>
-    </w:p>
-    <w:p>
-      <w:pPr>
-        <w:spacing w:line="480" w:lineRule="auto"/>
-        <w:ind w:firstLine="720"/>
-        <w:contextualSpacing/>
-        <w:jc w:val="center"/>
-        <w:rPr>
-          <w:rFonts w:ascii="Times New Roman" w:hAnsi="Times New Roman" w:cs="Times New Roman"/>
-          <w:sz w:val="24"/>
-          <w:szCs w:val="24"/>
-        </w:rPr>
-      </w:pPr>
-      <w:r>
-        <w:rPr>
-          <w:rFonts w:ascii="Times New Roman" w:hAnsi="Times New Roman" w:cs="Times New Roman"/>
-          <w:sz w:val="24"/>
-          <w:szCs w:val="24"/>
-        </w:rPr>
-        <w:t>AI Disclosure</w:t>
-      </w:r>
-    </w:p>
-    <w:p>
-      <w:pPr>
-        <w:spacing w:line="480" w:lineRule="auto"/>
-        <w:ind w:firstLine="720"/>
-        <w:contextualSpacing/>
-        <w:rPr>
-          <w:rFonts w:ascii="Times New Roman" w:hAnsi="Times New Roman" w:cs="Times New Roman"/>
-          <w:sz w:val="24"/>
-          <w:szCs w:val="24"/>
-        </w:rPr>
-      </w:pPr>
-      <w:r>
-        <w:rPr>
-          <w:rFonts w:ascii="Times New Roman" w:hAnsi="Times New Roman" w:cs="Times New Roman"/>
-          <w:sz w:val="24"/>
-          <w:szCs w:val="24"/>
-        </w:rPr>
-        <w:t>AI tools may be used to help with the project. The team will review and test any AI-generated code before using it. The team will make sure they understand the code and will be responsible for the final application.</w:t>
+      <w:r>
+        <w:rPr>
+          <w:rFonts w:ascii="Times New Roman" w:hAnsi="Times New Roman" w:cs="Times New Roman"/>
+          <w:sz w:val="24"/>
+          <w:szCs w:val="24"/>
+        </w:rPr>
+        <w:t xml:space="preserve">Our team used ChatGPT to review our proposal against the project requirements and improve the organization and clarity of our ideas. It helped us better understand how to structure </w:t>
+      </w:r>
+      <w:r>
+        <w:rPr>
+          <w:rFonts w:ascii="Times New Roman" w:hAnsi="Times New Roman" w:cs="Times New Roman"/>
+          <w:sz w:val="24"/>
+          <w:szCs w:val="24"/>
+        </w:rPr>
+        <w:lastRenderedPageBreak/>
+        <w:t>our data model, including the many-to-many relationship between earbuds and features, and how our planned functionality connects to the project requirements. Our team will review, understand, and be responsible for all final design and implementation decisions.</w:t>
       </w:r>
     </w:p>
     <w:sectPr>
-      <w:headerReference w:type="default" r:id="rId8"/>
+      <w:headerReference w:type="default" r:id="rId7"/>
       <w:pgSz w:w="12240" w:h="15840"/>
       <w:pgMar w:top="1440" w:right="1440" w:bottom="1440" w:left="1440" w:header="720" w:footer="720" w:gutter="0"/>
       <w:cols w:space="720"/>
@@ -1030,7 +795,7 @@
 </file>
 
 <file path=word/endnotes.xml><?xml version="1.0" encoding="utf-8"?>
-<w:endnotes xmlns:wpc="http://schemas.microsoft.com/office/word/2010/wordprocessingCanvas" xmlns:cx="http://schemas.microsoft.com/office/drawing/2014/chartex" xmlns:cx1="http://schemas.microsoft.com/office/drawing/2015/9/8/chartex" xmlns:cx2="http://schemas.microsoft.com/office/drawing/2015/10/21/chartex" xmlns:cx3="http://schemas.microsoft.com/office/drawing/2016/5/9/chartex" xmlns:cx4="http://schemas.microsoft.com/office/drawing/2016/5/10/chartex" xmlns:cx5="http://schemas.microsoft.com/office/drawing/2016/5/11/chartex" xmlns:cx6="http://schemas.microsoft.com/office/drawing/2016/5/12/chartex" xmlns:cx7="http://schemas.microsoft.com/office/drawing/2016/5/13/chartex" xmlns:cx8="http://schemas.microsoft.com/office/drawing/2016/5/14/chartex" xmlns:mc="http://schemas.openxmlformats.org/markup-compatibility/2006" xmlns:aink="http://schemas.microsoft.com/office/drawing/2016/ink" xmlns:am3d="http://schemas.microsoft.com/office/drawing/2017/model3d" xmlns:o="urn:schemas-microsoft-com:office:office" xmlns:oel="http://schemas.microsoft.com/office/2019/extlst" xmlns:r="http://schemas.openxmlformats.org/officeDocument/2006/relationships" xmlns:m="http://schemas.openxmlformats.org/officeDocument/2006/math" xmlns:v="urn:schemas-microsoft-com:vml" xmlns:wp14="http://schemas.microsoft.com/office/word/2010/wordprocessingDrawing" xmlns:wp="http://schemas.openxmlformats.org/drawingml/2006/wordprocessingDrawing" xmlns:w10="urn:schemas-microsoft-com:office:word" xmlns:w="http://schemas.openxmlformats.org/wordprocessingml/2006/main" xmlns:w14="http://schemas.microsoft.com/office/word/2010/wordml" xmlns:w15="http://schemas.microsoft.com/office/word/2012/wordml" xmlns:w16cex="http://schemas.microsoft.com/office/word/2018/wordml/cex" xmlns:w16cid="http://schemas.microsoft.com/office/word/2016/wordml/cid" xmlns:w16="http://schemas.microsoft.com/office/word/2018/wordml" xmlns:w16du="http://schemas.microsoft.com/office/word/2023/wordml/word16du" xmlns:w16sdtdh="http://schemas.microsoft.com/office/word/2020/wordml/sdtdatahash" xmlns:w16sdtfl="http://schemas.microsoft.com/office/word/2024/wordml/sdtformatlock" xmlns:w16se="http://schemas.microsoft.com/office/word/2015/wordml/symex" xmlns:wpg="http://schemas.microsoft.com/office/word/2010/wordprocessingGroup" xmlns:wpi="http://schemas.microsoft.com/office/word/2010/wordprocessingInk" xmlns:wne="http://schemas.microsoft.com/office/word/2006/wordml" xmlns:wps="http://schemas.microsoft.com/office/word/2010/wordprocessingShape" mc:Ignorable="w14 w15 w16se w16cid w16 w16cex w16sdtdh w16sdtfl w16du wp14">
+<w:endnotes xmlns:wpc="http://schemas.microsoft.com/office/word/2010/wordprocessingCanvas" xmlns:cx="http://schemas.microsoft.com/office/drawing/2014/chartex" xmlns:cx1="http://schemas.microsoft.com/office/drawing/2015/9/8/chartex" xmlns:cx2="http://schemas.microsoft.com/office/drawing/2015/10/21/chartex" xmlns:cx3="http://schemas.microsoft.com/office/drawing/2016/5/9/chartex" xmlns:cx4="http://schemas.microsoft.com/office/drawing/2016/5/10/chartex" xmlns:cx5="http://schemas.microsoft.com/office/drawing/2016/5/11/chartex" xmlns:cx6="http://schemas.microsoft.com/office/drawing/2016/5/12/chartex" xmlns:cx7="http://schemas.microsoft.com/office/drawing/2016/5/13/chartex" xmlns:cx8="http://schemas.microsoft.com/office/drawing/2016/5/14/chartex" xmlns:mc="http://schemas.openxmlformats.org/markup-compatibility/2006" xmlns:aink="http://schemas.microsoft.com/office/drawing/2016/ink" xmlns:am3d="http://schemas.microsoft.com/office/drawing/2017/model3d" xmlns:o="urn:schemas-microsoft-com:office:office" xmlns:oel="http://schemas.microsoft.com/office/2019/extlst" xmlns:r="http://schemas.openxmlformats.org/officeDocument/2006/relationships" xmlns:m="http://schemas.openxmlformats.org/officeDocument/2006/math" xmlns:v="urn:schemas-microsoft-com:vml" xmlns:wp14="http://schemas.microsoft.com/office/word/2010/wordprocessingDrawing" xmlns:wp="http://schemas.openxmlformats.org/drawingml/2006/wordprocessingDrawing" xmlns:w10="urn:schemas-microsoft-com:office:word" xmlns:w="http://schemas.openxmlformats.org/wordprocessingml/2006/main" xmlns:w14="http://schemas.microsoft.com/office/word/2010/wordml" xmlns:w15="http://schemas.microsoft.com/office/word/2012/wordml" xmlns:w16cex="http://schemas.microsoft.com/office/word/2018/wordml/cex" xmlns:w16cid="http://schemas.microsoft.com/office/word/2016/wordml/cid" xmlns:w16="http://schemas.microsoft.com/office/word/2018/wordml" xmlns:w16sdtdh="http://schemas.microsoft.com/office/word/2020/wordml/sdtdatahash" xmlns:w16se="http://schemas.microsoft.com/office/word/2015/wordml/symex" xmlns:wpg="http://schemas.microsoft.com/office/word/2010/wordprocessingGroup" xmlns:wpi="http://schemas.microsoft.com/office/word/2010/wordprocessingInk" xmlns:wne="http://schemas.microsoft.com/office/word/2006/wordml" xmlns:wps="http://schemas.microsoft.com/office/word/2010/wordprocessingShape" mc:Ignorable="w14 w15 w16se w16cid w16 w16cex w16sdtdh wp14">
   <w:endnote w:type="separator" w:id="-1">
     <w:p>
       <w:pPr>
@@ -1055,7 +820,7 @@
 </file>
 
 <file path=word/footnotes.xml><?xml version="1.0" encoding="utf-8"?>
-<w:footnotes xmlns:wpc="http://schemas.microsoft.com/office/word/2010/wordprocessingCanvas" xmlns:cx="http://schemas.microsoft.com/office/drawing/2014/chartex" xmlns:cx1="http://schemas.microsoft.com/office/drawing/2015/9/8/chartex" xmlns:cx2="http://schemas.microsoft.com/office/drawing/2015/10/21/chartex" xmlns:cx3="http://schemas.microsoft.com/office/drawing/2016/5/9/chartex" xmlns:cx4="http://schemas.microsoft.com/office/drawing/2016/5/10/chartex" xmlns:cx5="http://schemas.microsoft.com/office/drawing/2016/5/11/chartex" xmlns:cx6="http://schemas.microsoft.com/office/drawing/2016/5/12/chartex" xmlns:cx7="http://schemas.microsoft.com/office/drawing/2016/5/13/chartex" xmlns:cx8="http://schemas.microsoft.com/office/drawing/2016/5/14/chartex" xmlns:mc="http://schemas.openxmlformats.org/markup-compatibility/2006" xmlns:aink="http://schemas.microsoft.com/office/drawing/2016/ink" xmlns:am3d="http://schemas.microsoft.com/office/drawing/2017/model3d" xmlns:o="urn:schemas-microsoft-com:office:office" xmlns:oel="http://schemas.microsoft.com/office/2019/extlst" xmlns:r="http://schemas.openxmlformats.org/officeDocument/2006/relationships" xmlns:m="http://schemas.openxmlformats.org/officeDocument/2006/math" xmlns:v="urn:schemas-microsoft-com:vml" xmlns:wp14="http://schemas.microsoft.com/office/word/2010/wordprocessingDrawing" xmlns:wp="http://schemas.openxmlformats.org/drawingml/2006/wordprocessingDrawing" xmlns:w10="urn:schemas-microsoft-com:office:word" xmlns:w="http://schemas.openxmlformats.org/wordprocessingml/2006/main" xmlns:w14="http://schemas.microsoft.com/office/word/2010/wordml" xmlns:w15="http://schemas.microsoft.com/office/word/2012/wordml" xmlns:w16cex="http://schemas.microsoft.com/office/word/2018/wordml/cex" xmlns:w16cid="http://schemas.microsoft.com/office/word/2016/wordml/cid" xmlns:w16="http://schemas.microsoft.com/office/word/2018/wordml" xmlns:w16du="http://schemas.microsoft.com/office/word/2023/wordml/word16du" xmlns:w16sdtdh="http://schemas.microsoft.com/office/word/2020/wordml/sdtdatahash" xmlns:w16sdtfl="http://schemas.microsoft.com/office/word/2024/wordml/sdtformatlock" xmlns:w16se="http://schemas.microsoft.com/office/word/2015/wordml/symex" xmlns:wpg="http://schemas.microsoft.com/office/word/2010/wordprocessingGroup" xmlns:wpi="http://schemas.microsoft.com/office/word/2010/wordprocessingInk" xmlns:wne="http://schemas.microsoft.com/office/word/2006/wordml" xmlns:wps="http://schemas.microsoft.com/office/word/2010/wordprocessingShape" mc:Ignorable="w14 w15 w16se w16cid w16 w16cex w16sdtdh w16sdtfl w16du wp14">
+<w:footnotes xmlns:wpc="http://schemas.microsoft.com/office/word/2010/wordprocessingCanvas" xmlns:cx="http://schemas.microsoft.com/office/drawing/2014/chartex" xmlns:cx1="http://schemas.microsoft.com/office/drawing/2015/9/8/chartex" xmlns:cx2="http://schemas.microsoft.com/office/drawing/2015/10/21/chartex" xmlns:cx3="http://schemas.microsoft.com/office/drawing/2016/5/9/chartex" xmlns:cx4="http://schemas.microsoft.com/office/drawing/2016/5/10/chartex" xmlns:cx5="http://schemas.microsoft.com/office/drawing/2016/5/11/chartex" xmlns:cx6="http://schemas.microsoft.com/office/drawing/2016/5/12/chartex" xmlns:cx7="http://schemas.microsoft.com/office/drawing/2016/5/13/chartex" xmlns:cx8="http://schemas.microsoft.com/office/drawing/2016/5/14/chartex" xmlns:mc="http://schemas.openxmlformats.org/markup-compatibility/2006" xmlns:aink="http://schemas.microsoft.com/office/drawing/2016/ink" xmlns:am3d="http://schemas.microsoft.com/office/drawing/2017/model3d" xmlns:o="urn:schemas-microsoft-com:office:office" xmlns:oel="http://schemas.microsoft.com/office/2019/extlst" xmlns:r="http://schemas.openxmlformats.org/officeDocument/2006/relationships" xmlns:m="http://schemas.openxmlformats.org/officeDocument/2006/math" xmlns:v="urn:schemas-microsoft-com:vml" xmlns:wp14="http://schemas.microsoft.com/office/word/2010/wordprocessingDrawing" xmlns:wp="http://schemas.openxmlformats.org/drawingml/2006/wordprocessingDrawing" xmlns:w10="urn:schemas-microsoft-com:office:word" xmlns:w="http://schemas.openxmlformats.org/wordprocessingml/2006/main" xmlns:w14="http://schemas.microsoft.com/office/word/2010/wordml" xmlns:w15="http://schemas.microsoft.com/office/word/2012/wordml" xmlns:w16cex="http://schemas.microsoft.com/office/word/2018/wordml/cex" xmlns:w16cid="http://schemas.microsoft.com/office/word/2016/wordml/cid" xmlns:w16="http://schemas.microsoft.com/office/word/2018/wordml" xmlns:w16sdtdh="http://schemas.microsoft.com/office/word/2020/wordml/sdtdatahash" xmlns:w16se="http://schemas.microsoft.com/office/word/2015/wordml/symex" xmlns:wpg="http://schemas.microsoft.com/office/word/2010/wordprocessingGroup" xmlns:wpi="http://schemas.microsoft.com/office/word/2010/wordprocessingInk" xmlns:wne="http://schemas.microsoft.com/office/word/2006/wordml" xmlns:wps="http://schemas.microsoft.com/office/word/2010/wordprocessingShape" mc:Ignorable="w14 w15 w16se w16cid w16 w16cex w16sdtdh wp14">
   <w:footnote w:type="separator" w:id="-1">
     <w:p>
       <w:pPr>
@@ -1080,7 +845,7 @@
 </file>
 
 <file path=word/header1.xml><?xml version="1.0" encoding="utf-8"?>
-<w:hdr xmlns:wpc="http://schemas.microsoft.com/office/word/2010/wordprocessingCanvas" xmlns:cx="http://schemas.microsoft.com/office/drawing/2014/chartex" xmlns:cx1="http://schemas.microsoft.com/office/drawing/2015/9/8/chartex" xmlns:cx2="http://schemas.microsoft.com/office/drawing/2015/10/21/chartex" xmlns:cx3="http://schemas.microsoft.com/office/drawing/2016/5/9/chartex" xmlns:cx4="http://schemas.microsoft.com/office/drawing/2016/5/10/chartex" xmlns:cx5="http://schemas.microsoft.com/office/drawing/2016/5/11/chartex" xmlns:cx6="http://schemas.microsoft.com/office/drawing/2016/5/12/chartex" xmlns:cx7="http://schemas.microsoft.com/office/drawing/2016/5/13/chartex" xmlns:cx8="http://schemas.microsoft.com/office/drawing/2016/5/14/chartex" xmlns:mc="http://schemas.openxmlformats.org/markup-compatibility/2006" xmlns:aink="http://schemas.microsoft.com/office/drawing/2016/ink" xmlns:am3d="http://schemas.microsoft.com/office/drawing/2017/model3d" xmlns:o="urn:schemas-microsoft-com:office:office" xmlns:oel="http://schemas.microsoft.com/office/2019/extlst" xmlns:r="http://schemas.openxmlformats.org/officeDocument/2006/relationships" xmlns:m="http://schemas.openxmlformats.org/officeDocument/2006/math" xmlns:v="urn:schemas-microsoft-com:vml" xmlns:wp14="http://schemas.microsoft.com/office/word/2010/wordprocessingDrawing" xmlns:wp="http://schemas.openxmlformats.org/drawingml/2006/wordprocessingDrawing" xmlns:w10="urn:schemas-microsoft-com:office:word" xmlns:w="http://schemas.openxmlformats.org/wordprocessingml/2006/main" xmlns:w14="http://schemas.microsoft.com/office/word/2010/wordml" xmlns:w15="http://schemas.microsoft.com/office/word/2012/wordml" xmlns:w16cex="http://schemas.microsoft.com/office/word/2018/wordml/cex" xmlns:w16cid="http://schemas.microsoft.com/office/word/2016/wordml/cid" xmlns:w16="http://schemas.microsoft.com/office/word/2018/wordml" xmlns:w16du="http://schemas.microsoft.com/office/word/2023/wordml/word16du" xmlns:w16sdtdh="http://schemas.microsoft.com/office/word/2020/wordml/sdtdatahash" xmlns:w16sdtfl="http://schemas.microsoft.com/office/word/2024/wordml/sdtformatlock" xmlns:w16se="http://schemas.microsoft.com/office/word/2015/wordml/symex" xmlns:wpg="http://schemas.microsoft.com/office/word/2010/wordprocessingGroup" xmlns:wpi="http://schemas.microsoft.com/office/word/2010/wordprocessingInk" xmlns:wne="http://schemas.microsoft.com/office/word/2006/wordml" xmlns:wps="http://schemas.microsoft.com/office/word/2010/wordprocessingShape" mc:Ignorable="w14 w15 w16se w16cid w16 w16cex w16sdtdh w16sdtfl w16du wp14">
+<w:hdr xmlns:wpc="http://schemas.microsoft.com/office/word/2010/wordprocessingCanvas" xmlns:cx="http://schemas.microsoft.com/office/drawing/2014/chartex" xmlns:cx1="http://schemas.microsoft.com/office/drawing/2015/9/8/chartex" xmlns:cx2="http://schemas.microsoft.com/office/drawing/2015/10/21/chartex" xmlns:cx3="http://schemas.microsoft.com/office/drawing/2016/5/9/chartex" xmlns:cx4="http://schemas.microsoft.com/office/drawing/2016/5/10/chartex" xmlns:cx5="http://schemas.microsoft.com/office/drawing/2016/5/11/chartex" xmlns:cx6="http://schemas.microsoft.com/office/drawing/2016/5/12/chartex" xmlns:cx7="http://schemas.microsoft.com/office/drawing/2016/5/13/chartex" xmlns:cx8="http://schemas.microsoft.com/office/drawing/2016/5/14/chartex" xmlns:mc="http://schemas.openxmlformats.org/markup-compatibility/2006" xmlns:aink="http://schemas.microsoft.com/office/drawing/2016/ink" xmlns:am3d="http://schemas.microsoft.com/office/drawing/2017/model3d" xmlns:o="urn:schemas-microsoft-com:office:office" xmlns:oel="http://schemas.microsoft.com/office/2019/extlst" xmlns:r="http://schemas.openxmlformats.org/officeDocument/2006/relationships" xmlns:m="http://schemas.openxmlformats.org/officeDocument/2006/math" xmlns:v="urn:schemas-microsoft-com:vml" xmlns:wp14="http://schemas.microsoft.com/office/word/2010/wordprocessingDrawing" xmlns:wp="http://schemas.openxmlformats.org/drawingml/2006/wordprocessingDrawing" xmlns:w10="urn:schemas-microsoft-com:office:word" xmlns:w="http://schemas.openxmlformats.org/wordprocessingml/2006/main" xmlns:w14="http://schemas.microsoft.com/office/word/2010/wordml" xmlns:w15="http://schemas.microsoft.com/office/word/2012/wordml" xmlns:w16cex="http://schemas.microsoft.com/office/word/2018/wordml/cex" xmlns:w16cid="http://schemas.microsoft.com/office/word/2016/wordml/cid" xmlns:w16="http://schemas.microsoft.com/office/word/2018/wordml" xmlns:w16sdtdh="http://schemas.microsoft.com/office/word/2020/wordml/sdtdatahash" xmlns:w16se="http://schemas.microsoft.com/office/word/2015/wordml/symex" xmlns:wpg="http://schemas.microsoft.com/office/word/2010/wordprocessingGroup" xmlns:wpi="http://schemas.microsoft.com/office/word/2010/wordprocessingInk" xmlns:wne="http://schemas.microsoft.com/office/word/2006/wordml" xmlns:wps="http://schemas.microsoft.com/office/word/2010/wordprocessingShape" mc:Ignorable="w14 w15 w16se w16cid w16 w16cex w16sdtdh wp14">
   <w:p>
     <w:pPr>
       <w:pStyle w:val="Header"/>
@@ -1161,7 +926,7 @@
 </file>
 
 <file path=word/numbering.xml><?xml version="1.0" encoding="utf-8"?>
-<w:numbering xmlns:wpc="http://schemas.microsoft.com/office/word/2010/wordprocessingCanvas" xmlns:cx="http://schemas.microsoft.com/office/drawing/2014/chartex" xmlns:cx1="http://schemas.microsoft.com/office/drawing/2015/9/8/chartex" xmlns:cx2="http://schemas.microsoft.com/office/drawing/2015/10/21/chartex" xmlns:cx3="http://schemas.microsoft.com/office/drawing/2016/5/9/chartex" xmlns:cx4="http://schemas.microsoft.com/office/drawing/2016/5/10/chartex" xmlns:cx5="http://schemas.microsoft.com/office/drawing/2016/5/11/chartex" xmlns:cx6="http://schemas.microsoft.com/office/drawing/2016/5/12/chartex" xmlns:cx7="http://schemas.microsoft.com/office/drawing/2016/5/13/chartex" xmlns:cx8="http://schemas.microsoft.com/office/drawing/2016/5/14/chartex" xmlns:mc="http://schemas.openxmlformats.org/markup-compatibility/2006" xmlns:aink="http://schemas.microsoft.com/office/drawing/2016/ink" xmlns:am3d="http://schemas.microsoft.com/office/drawing/2017/model3d" xmlns:o="urn:schemas-microsoft-com:office:office" xmlns:oel="http://schemas.microsoft.com/office/2019/extlst" xmlns:r="http://schemas.openxmlformats.org/officeDocument/2006/relationships" xmlns:m="http://schemas.openxmlformats.org/officeDocument/2006/math" xmlns:v="urn:schemas-microsoft-com:vml" xmlns:wp14="http://schemas.microsoft.com/office/word/2010/wordprocessingDrawing" xmlns:wp="http://schemas.openxmlformats.org/drawingml/2006/wordprocessingDrawing" xmlns:w10="urn:schemas-microsoft-com:office:word" xmlns:w="http://schemas.openxmlformats.org/wordprocessingml/2006/main" xmlns:w14="http://schemas.microsoft.com/office/word/2010/wordml" xmlns:w15="http://schemas.microsoft.com/office/word/2012/wordml" xmlns:w16cex="http://schemas.microsoft.com/office/word/2018/wordml/cex" xmlns:w16cid="http://schemas.microsoft.com/office/word/2016/wordml/cid" xmlns:w16="http://schemas.microsoft.com/office/word/2018/wordml" xmlns:w16du="http://schemas.microsoft.com/office/word/2023/wordml/word16du" xmlns:w16sdtdh="http://schemas.microsoft.com/office/word/2020/wordml/sdtdatahash" xmlns:w16sdtfl="http://schemas.microsoft.com/office/word/2024/wordml/sdtformatlock" xmlns:w16se="http://schemas.microsoft.com/office/word/2015/wordml/symex" xmlns:wpg="http://schemas.microsoft.com/office/word/2010/wordprocessingGroup" xmlns:wpi="http://schemas.microsoft.com/office/word/2010/wordprocessingInk" xmlns:wne="http://schemas.microsoft.com/office/word/2006/wordml" xmlns:wps="http://schemas.microsoft.com/office/word/2010/wordprocessingShape" mc:Ignorable="w14 w15 w16se w16cid w16 w16cex w16sdtdh w16sdtfl w16du wp14">
+<w:numbering xmlns:wpc="http://schemas.microsoft.com/office/word/2010/wordprocessingCanvas" xmlns:cx="http://schemas.microsoft.com/office/drawing/2014/chartex" xmlns:cx1="http://schemas.microsoft.com/office/drawing/2015/9/8/chartex" xmlns:cx2="http://schemas.microsoft.com/office/drawing/2015/10/21/chartex" xmlns:cx3="http://schemas.microsoft.com/office/drawing/2016/5/9/chartex" xmlns:cx4="http://schemas.microsoft.com/office/drawing/2016/5/10/chartex" xmlns:cx5="http://schemas.microsoft.com/office/drawing/2016/5/11/chartex" xmlns:cx6="http://schemas.microsoft.com/office/drawing/2016/5/12/chartex" xmlns:cx7="http://schemas.microsoft.com/office/drawing/2016/5/13/chartex" xmlns:cx8="http://schemas.microsoft.com/office/drawing/2016/5/14/chartex" xmlns:mc="http://schemas.openxmlformats.org/markup-compatibility/2006" xmlns:aink="http://schemas.microsoft.com/office/drawing/2016/ink" xmlns:am3d="http://schemas.microsoft.com/office/drawing/2017/model3d" xmlns:o="urn:schemas-microsoft-com:office:office" xmlns:oel="http://schemas.microsoft.com/office/2019/extlst" xmlns:r="http://schemas.openxmlformats.org/officeDocument/2006/relationships" xmlns:m="http://schemas.openxmlformats.org/officeDocument/2006/math" xmlns:v="urn:schemas-microsoft-com:vml" xmlns:wp14="http://schemas.microsoft.com/office/word/2010/wordprocessingDrawing" xmlns:wp="http://schemas.openxmlformats.org/drawingml/2006/wordprocessingDrawing" xmlns:w10="urn:schemas-microsoft-com:office:word" xmlns:w="http://schemas.openxmlformats.org/wordprocessingml/2006/main" xmlns:w14="http://schemas.microsoft.com/office/word/2010/wordml" xmlns:w15="http://schemas.microsoft.com/office/word/2012/wordml" xmlns:w16cex="http://schemas.microsoft.com/office/word/2018/wordml/cex" xmlns:w16cid="http://schemas.microsoft.com/office/word/2016/wordml/cid" xmlns:w16="http://schemas.microsoft.com/office/word/2018/wordml" xmlns:w16sdtdh="http://schemas.microsoft.com/office/word/2020/wordml/sdtdatahash" xmlns:w16se="http://schemas.microsoft.com/office/word/2015/wordml/symex" xmlns:wpg="http://schemas.microsoft.com/office/word/2010/wordprocessingGroup" xmlns:wpi="http://schemas.microsoft.com/office/word/2010/wordprocessingInk" xmlns:wne="http://schemas.microsoft.com/office/word/2006/wordml" xmlns:wps="http://schemas.microsoft.com/office/word/2010/wordprocessingShape" mc:Ignorable="w14 w15 w16se w16cid w16 w16cex w16sdtdh wp14">
   <w:abstractNum w:abstractNumId="0" w15:restartNumberingAfterBreak="0">
     <w:nsid w:val="6FD93941"/>
     <w:multiLevelType w:val="hybridMultilevel"/>
@@ -1281,7 +1046,7 @@
 </file>
 
 <file path=word/styles.xml><?xml version="1.0" encoding="utf-8"?>
-<w:styles xmlns:mc="http://schemas.openxmlformats.org/markup-compatibility/2006" xmlns:r="http://schemas.openxmlformats.org/officeDocument/2006/relationships" xmlns:w="http://schemas.openxmlformats.org/wordprocessingml/2006/main" xmlns:w14="http://schemas.microsoft.com/office/word/2010/wordml" xmlns:w15="http://schemas.microsoft.com/office/word/2012/wordml" xmlns:w16cex="http://schemas.microsoft.com/office/word/2018/wordml/cex" xmlns:w16cid="http://schemas.microsoft.com/office/word/2016/wordml/cid" xmlns:w16="http://schemas.microsoft.com/office/word/2018/wordml" xmlns:w16du="http://schemas.microsoft.com/office/word/2023/wordml/word16du" xmlns:w16sdtdh="http://schemas.microsoft.com/office/word/2020/wordml/sdtdatahash" xmlns:w16sdtfl="http://schemas.microsoft.com/office/word/2024/wordml/sdtformatlock" xmlns:w16se="http://schemas.microsoft.com/office/word/2015/wordml/symex" mc:Ignorable="w14 w15 w16se w16cid w16 w16cex w16sdtdh w16sdtfl w16du">
+<w:styles xmlns:mc="http://schemas.openxmlformats.org/markup-compatibility/2006" xmlns:r="http://schemas.openxmlformats.org/officeDocument/2006/relationships" xmlns:w="http://schemas.openxmlformats.org/wordprocessingml/2006/main" xmlns:w14="http://schemas.microsoft.com/office/word/2010/wordml" xmlns:w15="http://schemas.microsoft.com/office/word/2012/wordml" xmlns:w16cex="http://schemas.microsoft.com/office/word/2018/wordml/cex" xmlns:w16cid="http://schemas.microsoft.com/office/word/2016/wordml/cid" xmlns:w16="http://schemas.microsoft.com/office/word/2018/wordml" xmlns:w16sdtdh="http://schemas.microsoft.com/office/word/2020/wordml/sdtdatahash" xmlns:w16se="http://schemas.microsoft.com/office/word/2015/wordml/symex" mc:Ignorable="w14 w15 w16se w16cid w16 w16cex w16sdtdh">
   <w:docDefaults>
     <w:rPrDefault>
       <w:rPr>

</xml_diff>